<commit_message>
Print dynamic date/time on tickets; widen waiting list; spell out TTS numbers
- ticket_image.py now draws the "التاريخ و الوقت: ..." line onto each
  ticket at print time (using arabic_reshaper + python-bidi for correct
  shaping), matching where the static text used to live before it was
  removed from the template image.
- vercel-app: show up to 30 waiting numbers in a grid instead of 5, and
  have the counter-call announcement spell numbers out as Arabic words
  since several TTS voices otherwise read them digit-by-digit.
</commit_message>
<xml_diff>
--- a/templates/ticket_template.docx
+++ b/templates/ticket_template.docx
@@ -210,474 +210,7 @@
         <mc:AlternateContent>
           <mc:Choice Requires="wps">
             <w:drawing>
-              <wp:anchor distT="45720" distB="45720" distL="114300" distR="114300" simplePos="0" relativeHeight="251669504" behindDoc="0" locked="0" layoutInCell="1" allowOverlap="1" wp14:anchorId="61D2CC35" wp14:editId="45CF8665">
-                <wp:simplePos x="0" y="0"/>
-                <wp:positionH relativeFrom="margin">
-                  <wp:align>left</wp:align>
-                </wp:positionH>
-                <wp:positionV relativeFrom="paragraph">
-                  <wp:posOffset>2402840</wp:posOffset>
-                </wp:positionV>
-                <wp:extent cx="1943100" cy="522605"/>
-                <wp:effectExtent l="0" t="0" r="0" b="0"/>
-                <wp:wrapSquare wrapText="bothSides"/>
-                <wp:docPr id="1915664999" name="Text Box 2"/>
-                <wp:cNvGraphicFramePr>
-                  <a:graphicFrameLocks xmlns:a="http://schemas.openxmlformats.org/drawingml/2006/main"/>
-                </wp:cNvGraphicFramePr>
-                <a:graphic xmlns:a="http://schemas.openxmlformats.org/drawingml/2006/main">
-                  <a:graphicData uri="http://schemas.microsoft.com/office/word/2010/wordprocessingShape">
-                    <wps:wsp>
-                      <wps:cNvSpPr txBox="1">
-                        <a:spLocks noChangeArrowheads="1"/>
-                      </wps:cNvSpPr>
-                      <wps:spPr bwMode="auto">
-                        <a:xfrm>
-                          <a:off x="0" y="0"/>
-                          <a:ext cx="1943100" cy="522605"/>
-                        </a:xfrm>
-                        <a:prstGeom prst="rect">
-                          <a:avLst/>
-                        </a:prstGeom>
-                        <a:noFill/>
-                        <a:ln>
-                          <a:noFill/>
-                        </a:ln>
-                      </wps:spPr>
-                      <wps:style>
-                        <a:lnRef idx="0">
-                          <a:scrgbClr r="0" g="0" b="0"/>
-                        </a:lnRef>
-                        <a:fillRef idx="0">
-                          <a:scrgbClr r="0" g="0" b="0"/>
-                        </a:fillRef>
-                        <a:effectRef idx="0">
-                          <a:scrgbClr r="0" g="0" b="0"/>
-                        </a:effectRef>
-                        <a:fontRef idx="minor">
-                          <a:schemeClr val="dk1"/>
-                        </a:fontRef>
-                      </wps:style>
-                      <wps:txbx>
-                        <w:txbxContent>
-                          <w:p>
-                            <w:pPr>
-                              <w:bidi/>
-                              <w:jc w:val="center"/>
-                              <w:rPr>
-                                <w:b/>
-                                <w:bCs/>
-                                <w:sz w:val="14"/>
-                                <w:szCs w:val="14"/>
-                                <w:lang w:bidi="ar-EG"/>
-                              </w:rPr>
-                            </w:pPr>
-                            <w:r>
-                              <w:rPr>
-                                <w:rFonts w:hint="cs"/>
-                                <w:b/>
-                                <w:bCs/>
-                                <w:sz w:val="14"/>
-                                <w:szCs w:val="14"/>
-                                <w:rtl/>
-                                <w:lang w:bidi="ar-EG"/>
-                              </w:rPr>
-                              <w:t>التاريخ و الوقت:</w:t>
-                            </w:r>
-                            <w:r>
-                              <w:rPr>
-                                <w:rFonts w:hint="cs"/>
-                                <w:b/>
-                                <w:bCs/>
-                                <w:sz w:val="14"/>
-                                <w:szCs w:val="14"/>
-                                <w:rtl/>
-                                <w:lang w:bidi="ar-EG"/>
-                              </w:rPr>
-                              <w:t xml:space="preserve"> </w:t>
-                            </w:r>
-                            <w:r>
-                              <w:rPr>
-                                <w:rFonts w:hint="cs"/>
-                                <w:b/>
-                                <w:bCs/>
-                                <w:sz w:val="14"/>
-                                <w:szCs w:val="14"/>
-                                <w:rtl/>
-                                <w:lang w:bidi="ar-EG"/>
-                              </w:rPr>
-                              <w:t>‏</w:t>
-                            </w:r>
-                            <w:r>
-                              <w:rPr>
-                                <w:b/>
-                                <w:bCs/>
-                                <w:sz w:val="14"/>
-                                <w:szCs w:val="14"/>
-                                <w:rtl/>
-                                <w:lang w:bidi="ar-EG"/>
-                              </w:rPr>
-                              <w:fldChar w:fldCharType="begin"/>
-                            </w:r>
-                            <w:r>
-                              <w:rPr>
-                                <w:b/>
-                                <w:bCs/>
-                                <w:sz w:val="14"/>
-                                <w:szCs w:val="14"/>
-                                <w:rtl/>
-                                <w:lang w:bidi="ar-EG"/>
-                              </w:rPr>
-                              <w:instrText xml:space="preserve"> </w:instrText>
-                            </w:r>
-                            <w:r>
-                              <w:rPr>
-                                <w:rFonts w:hint="cs"/>
-                                <w:b/>
-                                <w:bCs/>
-                                <w:sz w:val="14"/>
-                                <w:szCs w:val="14"/>
-                                <w:lang w:bidi="ar-EG"/>
-                              </w:rPr>
-                              <w:instrText>DATE</w:instrText>
-                            </w:r>
-                            <w:r>
-                              <w:rPr>
-                                <w:rFonts w:hint="cs"/>
-                                <w:b/>
-                                <w:bCs/>
-                                <w:sz w:val="14"/>
-                                <w:szCs w:val="14"/>
-                                <w:rtl/>
-                                <w:lang w:bidi="ar-EG"/>
-                              </w:rPr>
-                              <w:instrText xml:space="preserve"> \@ "</w:instrText>
-                            </w:r>
-                            <w:r>
-                              <w:rPr>
-                                <w:rFonts w:hint="cs"/>
-                                <w:b/>
-                                <w:bCs/>
-                                <w:sz w:val="14"/>
-                                <w:szCs w:val="14"/>
-                                <w:lang w:bidi="ar-EG"/>
-                              </w:rPr>
-                              <w:instrText>dd/MM/yyyy hh:mm am/pm</w:instrText>
-                            </w:r>
-                            <w:r>
-                              <w:rPr>
-                                <w:rFonts w:hint="cs"/>
-                                <w:b/>
-                                <w:bCs/>
-                                <w:sz w:val="14"/>
-                                <w:szCs w:val="14"/>
-                                <w:rtl/>
-                                <w:lang w:bidi="ar-EG"/>
-                              </w:rPr>
-                              <w:instrText>"</w:instrText>
-                            </w:r>
-                            <w:r>
-                              <w:rPr>
-                                <w:b/>
-                                <w:bCs/>
-                                <w:sz w:val="14"/>
-                                <w:szCs w:val="14"/>
-                                <w:rtl/>
-                                <w:lang w:bidi="ar-EG"/>
-                              </w:rPr>
-                              <w:instrText xml:space="preserve"> </w:instrText>
-                            </w:r>
-                            <w:r>
-                              <w:rPr>
-                                <w:b/>
-                                <w:bCs/>
-                                <w:sz w:val="14"/>
-                                <w:szCs w:val="14"/>
-                                <w:rtl/>
-                                <w:lang w:bidi="ar-EG"/>
-                              </w:rPr>
-                              <w:fldChar w:fldCharType="separate"/>
-                            </w:r>
-                            <w:r>
-                              <w:rPr>
-                                <w:rFonts w:hint="cs"/>
-                                <w:b/>
-                                <w:bCs/>
-                                <w:noProof/>
-                                <w:sz w:val="14"/>
-                                <w:szCs w:val="14"/>
-                                <w:rtl/>
-                                <w:lang w:bidi="ar-EG"/>
-                              </w:rPr>
-                              <w:t>‏</w:t>
-                            </w:r>
-                            <w:r>
-                              <w:rPr>
-                                <w:b/>
-                                <w:bCs/>
-                                <w:noProof/>
-                                <w:sz w:val="14"/>
-                                <w:szCs w:val="14"/>
-                                <w:rtl/>
-                                <w:lang w:bidi="ar-EG"/>
-                              </w:rPr>
-                              <w:t xml:space="preserve">09‏/08‏/2026‏ 08:20 </w:t>
-                            </w:r>
-                            <w:r>
-                              <w:rPr>
-                                <w:rFonts w:hint="cs"/>
-                                <w:b/>
-                                <w:bCs/>
-                                <w:noProof/>
-                                <w:sz w:val="14"/>
-                                <w:szCs w:val="14"/>
-                                <w:rtl/>
-                                <w:lang w:bidi="ar-EG"/>
-                              </w:rPr>
-                              <w:t>م</w:t>
-                            </w:r>
-                            <w:r>
-                              <w:rPr>
-                                <w:b/>
-                                <w:bCs/>
-                                <w:sz w:val="14"/>
-                                <w:szCs w:val="14"/>
-                                <w:rtl/>
-                                <w:lang w:bidi="ar-EG"/>
-                              </w:rPr>
-                              <w:fldChar w:fldCharType="end"/>
-                            </w:r>
-                          </w:p>
-                        </w:txbxContent>
-                      </wps:txbx>
-                      <wps:bodyPr rot="0" vert="horz" wrap="square" lIns="91440" tIns="45720" rIns="91440" bIns="45720" anchor="b" anchorCtr="0">
-                        <a:noAutofit/>
-                      </wps:bodyPr>
-                    </wps:wsp>
-                  </a:graphicData>
-                </a:graphic>
-                <wp14:sizeRelH relativeFrom="margin">
-                  <wp14:pctWidth>0</wp14:pctWidth>
-                </wp14:sizeRelH>
-                <wp14:sizeRelV relativeFrom="margin">
-                  <wp14:pctHeight>0</wp14:pctHeight>
-                </wp14:sizeRelV>
-              </wp:anchor>
-            </w:drawing>
-          </mc:Choice>
-          <mc:Fallback>
-            <w:pict>
-              <v:shapetype w14:anchorId="61D2CC35" id="_x0000_t202" coordsize="21600,21600" o:spt="202" path="m,l,21600r21600,l21600,xe">
-                <v:stroke joinstyle="miter"/>
-                <v:path gradientshapeok="t" o:connecttype="rect"/>
-              </v:shapetype>
-              <v:shape id="_x0000_s1027" type="#_x0000_t202" style="position:absolute;margin-left:0;margin-top:189.2pt;width:153pt;height:41.15pt;z-index:251669504;visibility:visible;mso-wrap-style:square;mso-width-percent:0;mso-height-percent:0;mso-wrap-distance-left:9pt;mso-wrap-distance-top:3.6pt;mso-wrap-distance-right:9pt;mso-wrap-distance-bottom:3.6pt;mso-position-horizontal:left;mso-position-horizontal-relative:margin;mso-position-vertical:absolute;mso-position-vertical-relative:text;mso-width-percent:0;mso-height-percent:0;mso-width-relative:margin;mso-height-relative:margin;v-text-anchor:bottom" o:gfxdata="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" filled="f" stroked="f">
-                <v:textbox>
-                  <w:txbxContent>
-                    <w:p>
-                      <w:pPr>
-                        <w:bidi/>
-                        <w:jc w:val="center"/>
-                        <w:rPr>
-                          <w:b/>
-                          <w:bCs/>
-                          <w:sz w:val="14"/>
-                          <w:szCs w:val="14"/>
-                          <w:lang w:bidi="ar-EG"/>
-                        </w:rPr>
-                      </w:pPr>
-                      <w:r>
-                        <w:rPr>
-                          <w:rFonts w:hint="cs"/>
-                          <w:b/>
-                          <w:bCs/>
-                          <w:sz w:val="14"/>
-                          <w:szCs w:val="14"/>
-                          <w:rtl/>
-                          <w:lang w:bidi="ar-EG"/>
-                        </w:rPr>
-                        <w:t>التاريخ و الوقت:</w:t>
-                      </w:r>
-                      <w:r>
-                        <w:rPr>
-                          <w:rFonts w:hint="cs"/>
-                          <w:b/>
-                          <w:bCs/>
-                          <w:sz w:val="14"/>
-                          <w:szCs w:val="14"/>
-                          <w:rtl/>
-                          <w:lang w:bidi="ar-EG"/>
-                        </w:rPr>
-                        <w:t xml:space="preserve"> </w:t>
-                      </w:r>
-                      <w:r>
-                        <w:rPr>
-                          <w:rFonts w:hint="cs"/>
-                          <w:b/>
-                          <w:bCs/>
-                          <w:sz w:val="14"/>
-                          <w:szCs w:val="14"/>
-                          <w:rtl/>
-                          <w:lang w:bidi="ar-EG"/>
-                        </w:rPr>
-                        <w:t>‏</w:t>
-                      </w:r>
-                      <w:r>
-                        <w:rPr>
-                          <w:b/>
-                          <w:bCs/>
-                          <w:sz w:val="14"/>
-                          <w:szCs w:val="14"/>
-                          <w:rtl/>
-                          <w:lang w:bidi="ar-EG"/>
-                        </w:rPr>
-                        <w:fldChar w:fldCharType="begin"/>
-                      </w:r>
-                      <w:r>
-                        <w:rPr>
-                          <w:b/>
-                          <w:bCs/>
-                          <w:sz w:val="14"/>
-                          <w:szCs w:val="14"/>
-                          <w:rtl/>
-                          <w:lang w:bidi="ar-EG"/>
-                        </w:rPr>
-                        <w:instrText xml:space="preserve"> </w:instrText>
-                      </w:r>
-                      <w:r>
-                        <w:rPr>
-                          <w:rFonts w:hint="cs"/>
-                          <w:b/>
-                          <w:bCs/>
-                          <w:sz w:val="14"/>
-                          <w:szCs w:val="14"/>
-                          <w:lang w:bidi="ar-EG"/>
-                        </w:rPr>
-                        <w:instrText>DATE</w:instrText>
-                      </w:r>
-                      <w:r>
-                        <w:rPr>
-                          <w:rFonts w:hint="cs"/>
-                          <w:b/>
-                          <w:bCs/>
-                          <w:sz w:val="14"/>
-                          <w:szCs w:val="14"/>
-                          <w:rtl/>
-                          <w:lang w:bidi="ar-EG"/>
-                        </w:rPr>
-                        <w:instrText xml:space="preserve"> \@ "</w:instrText>
-                      </w:r>
-                      <w:r>
-                        <w:rPr>
-                          <w:rFonts w:hint="cs"/>
-                          <w:b/>
-                          <w:bCs/>
-                          <w:sz w:val="14"/>
-                          <w:szCs w:val="14"/>
-                          <w:lang w:bidi="ar-EG"/>
-                        </w:rPr>
-                        <w:instrText>dd/MM/yyyy hh:mm am/pm</w:instrText>
-                      </w:r>
-                      <w:r>
-                        <w:rPr>
-                          <w:rFonts w:hint="cs"/>
-                          <w:b/>
-                          <w:bCs/>
-                          <w:sz w:val="14"/>
-                          <w:szCs w:val="14"/>
-                          <w:rtl/>
-                          <w:lang w:bidi="ar-EG"/>
-                        </w:rPr>
-                        <w:instrText>"</w:instrText>
-                      </w:r>
-                      <w:r>
-                        <w:rPr>
-                          <w:b/>
-                          <w:bCs/>
-                          <w:sz w:val="14"/>
-                          <w:szCs w:val="14"/>
-                          <w:rtl/>
-                          <w:lang w:bidi="ar-EG"/>
-                        </w:rPr>
-                        <w:instrText xml:space="preserve"> </w:instrText>
-                      </w:r>
-                      <w:r>
-                        <w:rPr>
-                          <w:b/>
-                          <w:bCs/>
-                          <w:sz w:val="14"/>
-                          <w:szCs w:val="14"/>
-                          <w:rtl/>
-                          <w:lang w:bidi="ar-EG"/>
-                        </w:rPr>
-                        <w:fldChar w:fldCharType="separate"/>
-                      </w:r>
-                      <w:r>
-                        <w:rPr>
-                          <w:rFonts w:hint="cs"/>
-                          <w:b/>
-                          <w:bCs/>
-                          <w:noProof/>
-                          <w:sz w:val="14"/>
-                          <w:szCs w:val="14"/>
-                          <w:rtl/>
-                          <w:lang w:bidi="ar-EG"/>
-                        </w:rPr>
-                        <w:t>‏</w:t>
-                      </w:r>
-                      <w:r>
-                        <w:rPr>
-                          <w:b/>
-                          <w:bCs/>
-                          <w:noProof/>
-                          <w:sz w:val="14"/>
-                          <w:szCs w:val="14"/>
-                          <w:rtl/>
-                          <w:lang w:bidi="ar-EG"/>
-                        </w:rPr>
-                        <w:t xml:space="preserve">09‏/08‏/2026‏ 08:20 </w:t>
-                      </w:r>
-                      <w:r>
-                        <w:rPr>
-                          <w:rFonts w:hint="cs"/>
-                          <w:b/>
-                          <w:bCs/>
-                          <w:noProof/>
-                          <w:sz w:val="14"/>
-                          <w:szCs w:val="14"/>
-                          <w:rtl/>
-                          <w:lang w:bidi="ar-EG"/>
-                        </w:rPr>
-                        <w:t>م</w:t>
-                      </w:r>
-                      <w:r>
-                        <w:rPr>
-                          <w:b/>
-                          <w:bCs/>
-                          <w:sz w:val="14"/>
-                          <w:szCs w:val="14"/>
-                          <w:rtl/>
-                          <w:lang w:bidi="ar-EG"/>
-                        </w:rPr>
-                        <w:fldChar w:fldCharType="end"/>
-                      </w:r>
-                    </w:p>
-                  </w:txbxContent>
-                </v:textbox>
-                <w10:wrap type="square" anchorx="margin"/>
-              </v:shape>
-            </w:pict>
-          </mc:Fallback>
-        </mc:AlternateContent>
-      </w:r>
-      <w:r>
-        <w:rPr>
-          <w:noProof/>
-        </w:rPr>
-        <mc:AlternateContent>
-          <mc:Choice Requires="wps">
-            <w:drawing>
-              <wp:inline distT="0" distB="0" distL="0" distR="0" wp14:anchorId="032CEAE0" wp14:editId="6622B923">
+              <wp:inline distT="0" distB="0" distL="0" distR="0" wp14:anchorId="032CEAE0" wp14:editId="6DDEAA8B">
                 <wp:extent cx="304800" cy="304800"/>
                 <wp:effectExtent l="0" t="0" r="0" b="0"/>
                 <wp:docPr id="1912854293" name="Rectangle 2"/>
@@ -733,7 +266,7 @@
           </mc:Choice>
           <mc:Fallback>
             <w:pict>
-              <v:rect w14:anchorId="67E5763E" id="Rectangle 2" o:spid="_x0000_s1026" style="width:24pt;height:24pt;visibility:visible;mso-wrap-style:square;mso-left-percent:-10001;mso-top-percent:-10001;mso-position-horizontal:absolute;mso-position-horizontal-relative:char;mso-position-vertical:absolute;mso-position-vertical-relative:line;mso-left-percent:-10001;mso-top-percent:-10001;v-text-anchor:top" o:gfxdata="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" filled="f" stroked="f">
+              <v:rect w14:anchorId="20AB2A06" id="Rectangle 2" o:spid="_x0000_s1026" style="width:24pt;height:24pt;visibility:visible;mso-wrap-style:square;mso-left-percent:-10001;mso-top-percent:-10001;mso-position-horizontal:absolute;mso-position-horizontal-relative:char;mso-position-vertical:absolute;mso-position-vertical-relative:line;mso-left-percent:-10001;mso-top-percent:-10001;v-text-anchor:top" o:gfxdata="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" filled="f" stroked="f">
                 <o:lock v:ext="edit" aspectratio="t"/>
                 <w10:anchorlock/>
               </v:rect>

</xml_diff>